<commit_message>
finished with homogenious coordinates
</commit_message>
<xml_diff>
--- a/books/(ru)-HomogeneousCoordinates.docx
+++ b/books/(ru)-HomogeneousCoordinates.docx
@@ -5,7 +5,7 @@
     <w:bookmarkStart w:id="0" w:name="_Toc185535795"/>
     <w:p>
       <w:pPr>
-        <w:pStyle w:val="Heading1"/>
+        <w:pStyle w:val="1"/>
         <w:rPr>
           <w:lang w:val="ru-RU"/>
         </w:rPr>
@@ -139,6 +139,12 @@
     </w:p>
     <w:sdt>
       <w:sdtPr>
+        <w:rPr>
+          <w:rFonts w:asciiTheme="minorHAnsi" w:eastAsiaTheme="minorHAnsi" w:hAnsiTheme="minorHAnsi" w:cstheme="minorBidi"/>
+          <w:color w:val="auto"/>
+          <w:sz w:val="22"/>
+          <w:szCs w:val="22"/>
+        </w:rPr>
         <w:id w:val="1734820540"/>
         <w:docPartObj>
           <w:docPartGallery w:val="Table of Contents"/>
@@ -147,19 +153,15 @@
       </w:sdtPr>
       <w:sdtEndPr>
         <w:rPr>
-          <w:rFonts w:asciiTheme="minorHAnsi" w:eastAsiaTheme="minorHAnsi" w:hAnsiTheme="minorHAnsi" w:cstheme="minorBidi"/>
           <w:b/>
           <w:bCs/>
           <w:noProof/>
-          <w:color w:val="auto"/>
-          <w:sz w:val="22"/>
-          <w:szCs w:val="22"/>
         </w:rPr>
       </w:sdtEndPr>
       <w:sdtContent>
         <w:p>
           <w:pPr>
-            <w:pStyle w:val="TOCHeading"/>
+            <w:pStyle w:val="a6"/>
             <w:rPr>
               <w:lang w:val="ru-RU"/>
             </w:rPr>
@@ -173,7 +175,7 @@
         </w:p>
         <w:p>
           <w:pPr>
-            <w:pStyle w:val="TOC1"/>
+            <w:pStyle w:val="11"/>
             <w:tabs>
               <w:tab w:val="right" w:leader="dot" w:pos="9350"/>
             </w:tabs>
@@ -193,7 +195,7 @@
           <w:hyperlink w:anchor="_Toc185535795" w:history="1">
             <w:r>
               <w:rPr>
-                <w:rStyle w:val="Hyperlink"/>
+                <w:rStyle w:val="a7"/>
                 <w:noProof/>
                 <w:lang w:val="ru-RU"/>
               </w:rPr>
@@ -251,7 +253,7 @@
         </w:p>
         <w:p>
           <w:pPr>
-            <w:pStyle w:val="TOC2"/>
+            <w:pStyle w:val="21"/>
             <w:tabs>
               <w:tab w:val="right" w:leader="dot" w:pos="9350"/>
             </w:tabs>
@@ -262,7 +264,7 @@
           <w:hyperlink w:anchor="_Toc185535796" w:history="1">
             <w:r>
               <w:rPr>
-                <w:rStyle w:val="Hyperlink"/>
+                <w:rStyle w:val="a7"/>
                 <w:noProof/>
                 <w:lang w:val="ru-RU"/>
               </w:rPr>
@@ -320,7 +322,7 @@
         </w:p>
         <w:p>
           <w:pPr>
-            <w:pStyle w:val="TOC2"/>
+            <w:pStyle w:val="21"/>
             <w:tabs>
               <w:tab w:val="right" w:leader="dot" w:pos="9350"/>
             </w:tabs>
@@ -331,7 +333,7 @@
           <w:hyperlink w:anchor="_Toc185535797" w:history="1">
             <w:r>
               <w:rPr>
-                <w:rStyle w:val="Hyperlink"/>
+                <w:rStyle w:val="a7"/>
                 <w:noProof/>
                 <w:lang w:val="ru-RU"/>
               </w:rPr>
@@ -389,7 +391,7 @@
         </w:p>
         <w:p>
           <w:pPr>
-            <w:pStyle w:val="TOC2"/>
+            <w:pStyle w:val="21"/>
             <w:tabs>
               <w:tab w:val="right" w:leader="dot" w:pos="9350"/>
             </w:tabs>
@@ -400,7 +402,7 @@
           <w:hyperlink w:anchor="_Toc185535798" w:history="1">
             <w:r>
               <w:rPr>
-                <w:rStyle w:val="Hyperlink"/>
+                <w:rStyle w:val="a7"/>
                 <w:noProof/>
                 <w:lang w:val="ru-RU"/>
               </w:rPr>
@@ -458,7 +460,7 @@
         </w:p>
         <w:p>
           <w:pPr>
-            <w:pStyle w:val="TOC2"/>
+            <w:pStyle w:val="21"/>
             <w:tabs>
               <w:tab w:val="right" w:leader="dot" w:pos="9350"/>
             </w:tabs>
@@ -469,7 +471,7 @@
           <w:hyperlink w:anchor="_Toc185535799" w:history="1">
             <w:r>
               <w:rPr>
-                <w:rStyle w:val="Hyperlink"/>
+                <w:rStyle w:val="a7"/>
                 <w:noProof/>
                 <w:lang w:val="ru-RU"/>
               </w:rPr>
@@ -527,7 +529,7 @@
         </w:p>
         <w:p>
           <w:pPr>
-            <w:pStyle w:val="TOC3"/>
+            <w:pStyle w:val="31"/>
             <w:tabs>
               <w:tab w:val="right" w:leader="dot" w:pos="9350"/>
             </w:tabs>
@@ -538,7 +540,7 @@
           <w:hyperlink w:anchor="_Toc185535800" w:history="1">
             <w:r>
               <w:rPr>
-                <w:rStyle w:val="Hyperlink"/>
+                <w:rStyle w:val="a7"/>
                 <w:noProof/>
                 <w:lang w:val="ru-RU"/>
               </w:rPr>
@@ -596,7 +598,7 @@
         </w:p>
         <w:p>
           <w:pPr>
-            <w:pStyle w:val="TOC3"/>
+            <w:pStyle w:val="31"/>
             <w:tabs>
               <w:tab w:val="right" w:leader="dot" w:pos="9350"/>
             </w:tabs>
@@ -607,7 +609,7 @@
           <w:hyperlink w:anchor="_Toc185535801" w:history="1">
             <w:r>
               <w:rPr>
-                <w:rStyle w:val="Hyperlink"/>
+                <w:rStyle w:val="a7"/>
                 <w:noProof/>
                 <w:lang w:val="ru-RU"/>
               </w:rPr>
@@ -665,7 +667,7 @@
         </w:p>
         <w:p>
           <w:pPr>
-            <w:pStyle w:val="TOC3"/>
+            <w:pStyle w:val="31"/>
             <w:tabs>
               <w:tab w:val="right" w:leader="dot" w:pos="9350"/>
             </w:tabs>
@@ -676,7 +678,7 @@
           <w:hyperlink w:anchor="_Toc185535802" w:history="1">
             <w:r>
               <w:rPr>
-                <w:rStyle w:val="Hyperlink"/>
+                <w:rStyle w:val="a7"/>
                 <w:noProof/>
                 <w:lang w:val="ru-RU"/>
               </w:rPr>
@@ -734,7 +736,7 @@
         </w:p>
         <w:p>
           <w:pPr>
-            <w:pStyle w:val="TOC3"/>
+            <w:pStyle w:val="31"/>
             <w:tabs>
               <w:tab w:val="right" w:leader="dot" w:pos="9350"/>
             </w:tabs>
@@ -745,7 +747,7 @@
           <w:hyperlink w:anchor="_Toc185535803" w:history="1">
             <w:r>
               <w:rPr>
-                <w:rStyle w:val="Hyperlink"/>
+                <w:rStyle w:val="a7"/>
                 <w:noProof/>
                 <w:lang w:val="ru-RU"/>
               </w:rPr>
@@ -803,7 +805,7 @@
         </w:p>
         <w:p>
           <w:pPr>
-            <w:pStyle w:val="TOC2"/>
+            <w:pStyle w:val="21"/>
             <w:tabs>
               <w:tab w:val="right" w:leader="dot" w:pos="9350"/>
             </w:tabs>
@@ -814,7 +816,7 @@
           <w:hyperlink w:anchor="_Toc185535804" w:history="1">
             <w:r>
               <w:rPr>
-                <w:rStyle w:val="Hyperlink"/>
+                <w:rStyle w:val="a7"/>
                 <w:noProof/>
                 <w:lang w:val="ru-RU"/>
               </w:rPr>
@@ -872,7 +874,7 @@
         </w:p>
         <w:p>
           <w:pPr>
-            <w:pStyle w:val="TOC2"/>
+            <w:pStyle w:val="21"/>
             <w:tabs>
               <w:tab w:val="right" w:leader="dot" w:pos="9350"/>
             </w:tabs>
@@ -883,7 +885,7 @@
           <w:hyperlink w:anchor="_Toc185535805" w:history="1">
             <w:r>
               <w:rPr>
-                <w:rStyle w:val="Hyperlink"/>
+                <w:rStyle w:val="a7"/>
                 <w:noProof/>
                 <w:lang w:val="ru-RU"/>
               </w:rPr>
@@ -953,7 +955,7 @@
     </w:sdt>
     <w:p>
       <w:pPr>
-        <w:pStyle w:val="Heading2"/>
+        <w:pStyle w:val="2"/>
         <w:rPr>
           <w:lang w:val="ru-RU"/>
         </w:rPr>
@@ -982,7 +984,7 @@
     </w:p>
     <w:p>
       <w:pPr>
-        <w:pStyle w:val="ListParagraph"/>
+        <w:pStyle w:val="a4"/>
         <w:numPr>
           <w:ilvl w:val="0"/>
           <w:numId w:val="1"/>
@@ -1000,7 +1002,7 @@
     </w:p>
     <w:p>
       <w:pPr>
-        <w:pStyle w:val="ListParagraph"/>
+        <w:pStyle w:val="a4"/>
         <w:numPr>
           <w:ilvl w:val="0"/>
           <w:numId w:val="1"/>
@@ -1040,7 +1042,7 @@
     </w:p>
     <w:p>
       <w:pPr>
-        <w:pStyle w:val="ListParagraph"/>
+        <w:pStyle w:val="a4"/>
         <w:numPr>
           <w:ilvl w:val="0"/>
           <w:numId w:val="1"/>
@@ -1079,7 +1081,7 @@
     </w:p>
     <w:p>
       <w:pPr>
-        <w:pStyle w:val="ListParagraph"/>
+        <w:pStyle w:val="a4"/>
         <w:numPr>
           <w:ilvl w:val="0"/>
           <w:numId w:val="1"/>
@@ -1118,7 +1120,7 @@
     </w:p>
     <w:p>
       <w:pPr>
-        <w:pStyle w:val="Heading2"/>
+        <w:pStyle w:val="2"/>
         <w:rPr>
           <w:rFonts w:eastAsiaTheme="minorEastAsia"/>
           <w:lang w:val="ru-RU"/>
@@ -3381,14 +3383,7 @@
             <w:rFonts w:ascii="Cambria Math" w:eastAsiaTheme="minorEastAsia" w:hAnsi="Cambria Math"/>
             <w:lang w:val="ru-RU"/>
           </w:rPr>
-          <m:t xml:space="preserve">, </m:t>
-        </m:r>
-        <m:r>
-          <w:rPr>
-            <w:rFonts w:ascii="Cambria Math" w:eastAsiaTheme="minorEastAsia" w:hAnsi="Cambria Math"/>
-            <w:lang w:val="ru-RU"/>
-          </w:rPr>
-          <m:t>xy,</m:t>
+          <m:t>, xy,</m:t>
         </m:r>
         <m:sSup>
           <m:sSupPr>
@@ -4713,7 +4708,7 @@
     </w:p>
     <w:p>
       <w:pPr>
-        <w:pStyle w:val="Heading2"/>
+        <w:pStyle w:val="2"/>
         <w:rPr>
           <w:lang w:val="ru-RU"/>
         </w:rPr>
@@ -5056,7 +5051,7 @@
     </w:p>
     <w:p>
       <w:pPr>
-        <w:pStyle w:val="Caption"/>
+        <w:pStyle w:val="a5"/>
         <w:jc w:val="center"/>
         <w:rPr>
           <w:lang w:val="ru-RU"/>
@@ -5339,7 +5334,7 @@
     </w:p>
     <w:p>
       <w:pPr>
-        <w:pStyle w:val="Heading2"/>
+        <w:pStyle w:val="2"/>
         <w:rPr>
           <w:rFonts w:eastAsiaTheme="minorEastAsia"/>
           <w:lang w:val="ru-RU"/>
@@ -5357,7 +5352,7 @@
     </w:p>
     <w:p>
       <w:pPr>
-        <w:pStyle w:val="Heading3"/>
+        <w:pStyle w:val="3"/>
         <w:rPr>
           <w:lang w:val="ru-RU"/>
         </w:rPr>
@@ -6118,7 +6113,10 @@
     </w:p>
     <w:p>
       <w:pPr>
-        <w:pStyle w:val="Heading3"/>
+        <w:pStyle w:val="3"/>
+        <w:rPr>
+          <w:lang w:val="ru-RU"/>
+        </w:rPr>
       </w:pPr>
       <w:bookmarkStart w:id="6" w:name="_Toc185535801"/>
       <w:r>
@@ -7378,6 +7376,7 @@
             <m:r>
               <w:rPr>
                 <w:rFonts w:ascii="Cambria Math" w:eastAsiaTheme="minorEastAsia" w:hAnsi="Cambria Math"/>
+                <w:lang w:val="ru-RU"/>
               </w:rPr>
               <m:t>, 0</m:t>
             </m:r>
@@ -7521,14 +7520,9 @@
             <m:r>
               <w:rPr>
                 <w:rFonts w:ascii="Cambria Math" w:eastAsiaTheme="minorEastAsia" w:hAnsi="Cambria Math"/>
-              </w:rPr>
-              <m:t>,</m:t>
-            </m:r>
-            <m:r>
-              <w:rPr>
-                <w:rFonts w:ascii="Cambria Math" w:eastAsiaTheme="minorEastAsia" w:hAnsi="Cambria Math"/>
-              </w:rPr>
-              <m:t>1</m:t>
+                <w:lang w:val="ru-RU"/>
+              </w:rPr>
+              <m:t>,1</m:t>
             </m:r>
           </m:e>
         </m:d>
@@ -7610,7 +7604,7 @@
     </w:p>
     <w:p>
       <w:pPr>
-        <w:pStyle w:val="ListParagraph"/>
+        <w:pStyle w:val="a4"/>
         <w:numPr>
           <w:ilvl w:val="0"/>
           <w:numId w:val="2"/>
@@ -7826,14 +7820,7 @@
                 <w:rFonts w:ascii="Cambria Math" w:eastAsiaTheme="minorEastAsia" w:hAnsi="Cambria Math"/>
                 <w:lang w:val="ru-RU"/>
               </w:rPr>
-              <m:t xml:space="preserve">, </m:t>
-            </m:r>
-            <m:r>
-              <w:rPr>
-                <w:rFonts w:ascii="Cambria Math" w:eastAsiaTheme="minorEastAsia" w:hAnsi="Cambria Math"/>
-                <w:lang w:val="ru-RU"/>
-              </w:rPr>
-              <m:t>0</m:t>
+              <m:t>, 0</m:t>
             </m:r>
           </m:e>
         </m:d>
@@ -7984,14 +7971,7 @@
               <w:rFonts w:ascii="Cambria Math" w:eastAsiaTheme="minorEastAsia" w:hAnsi="Cambria Math"/>
               <w:lang w:val="ru-RU"/>
             </w:rPr>
-            <m:t>=</m:t>
-          </m:r>
-          <m:r>
-            <w:rPr>
-              <w:rFonts w:ascii="Cambria Math" w:eastAsiaTheme="minorEastAsia" w:hAnsi="Cambria Math"/>
-              <w:lang w:val="ru-RU"/>
-            </w:rPr>
-            <m:t>(</m:t>
+            <m:t>=(</m:t>
           </m:r>
           <m:r>
             <w:rPr>
@@ -8076,7 +8056,7 @@
     </w:p>
     <w:p>
       <w:pPr>
-        <w:pStyle w:val="ListParagraph"/>
+        <w:pStyle w:val="a4"/>
         <w:numPr>
           <w:ilvl w:val="0"/>
           <w:numId w:val="2"/>
@@ -8159,14 +8139,7 @@
           <w:rFonts w:eastAsiaTheme="minorEastAsia"/>
           <w:lang w:val="ru-RU"/>
         </w:rPr>
-        <w:t xml:space="preserve"> и </w:t>
-      </w:r>
-      <w:r>
-        <w:rPr>
-          <w:rFonts w:eastAsiaTheme="minorEastAsia"/>
-          <w:lang w:val="ru-RU"/>
-        </w:rPr>
-        <w:t xml:space="preserve">вектора </w:t>
+        <w:t xml:space="preserve"> и вектора </w:t>
       </w:r>
       <m:oMath>
         <m:d>
@@ -8217,14 +8190,7 @@
                 <w:rFonts w:ascii="Cambria Math" w:eastAsiaTheme="minorEastAsia" w:hAnsi="Cambria Math"/>
                 <w:lang w:val="ru-RU"/>
               </w:rPr>
-              <m:t>,</m:t>
-            </m:r>
-            <m:r>
-              <w:rPr>
-                <w:rFonts w:ascii="Cambria Math" w:eastAsiaTheme="minorEastAsia" w:hAnsi="Cambria Math"/>
-                <w:lang w:val="ru-RU"/>
-              </w:rPr>
-              <m:t>0</m:t>
+              <m:t>,0</m:t>
             </m:r>
           </m:e>
         </m:d>
@@ -8450,14 +8416,7 @@
                   <w:rFonts w:ascii="Cambria Math" w:eastAsiaTheme="minorEastAsia" w:hAnsi="Cambria Math"/>
                   <w:lang w:val="ru-RU"/>
                 </w:rPr>
-                <m:t xml:space="preserve">, </m:t>
-              </m:r>
-              <m:r>
-                <w:rPr>
-                  <w:rFonts w:ascii="Cambria Math" w:eastAsiaTheme="minorEastAsia" w:hAnsi="Cambria Math"/>
-                  <w:lang w:val="ru-RU"/>
-                </w:rPr>
-                <m:t>1</m:t>
+                <m:t>, 1</m:t>
               </m:r>
             </m:e>
           </m:d>
@@ -8466,7 +8425,7 @@
     </w:p>
     <w:p>
       <w:pPr>
-        <w:pStyle w:val="ListParagraph"/>
+        <w:pStyle w:val="a4"/>
         <w:numPr>
           <w:ilvl w:val="0"/>
           <w:numId w:val="2"/>
@@ -8529,21 +8488,7 @@
             <w:rFonts w:ascii="Cambria Math" w:eastAsiaTheme="minorEastAsia" w:hAnsi="Cambria Math"/>
             <w:lang w:val="ru-RU"/>
           </w:rPr>
-          <m:t xml:space="preserve">, </m:t>
-        </m:r>
-        <m:r>
-          <w:rPr>
-            <w:rFonts w:ascii="Cambria Math" w:eastAsiaTheme="minorEastAsia" w:hAnsi="Cambria Math"/>
-            <w:lang w:val="ru-RU"/>
-          </w:rPr>
-          <m:t>0</m:t>
-        </m:r>
-        <m:r>
-          <w:rPr>
-            <w:rFonts w:ascii="Cambria Math" w:eastAsiaTheme="minorEastAsia" w:hAnsi="Cambria Math"/>
-            <w:lang w:val="ru-RU"/>
-          </w:rPr>
-          <m:t>)</m:t>
+          <m:t>, 0)</m:t>
         </m:r>
       </m:oMath>
       <w:r>
@@ -8683,14 +8628,7 @@
               <w:rFonts w:ascii="Cambria Math" w:eastAsiaTheme="minorEastAsia" w:hAnsi="Cambria Math"/>
               <w:lang w:val="ru-RU"/>
             </w:rPr>
-            <m:t xml:space="preserve">+ </m:t>
-          </m:r>
-          <m:r>
-            <w:rPr>
-              <w:rFonts w:ascii="Cambria Math" w:eastAsiaTheme="minorEastAsia" w:hAnsi="Cambria Math"/>
-              <w:lang w:val="ru-RU"/>
-            </w:rPr>
-            <m:t>(</m:t>
+            <m:t>+ (</m:t>
           </m:r>
           <m:r>
             <w:rPr>
@@ -8729,14 +8667,7 @@
               <w:rFonts w:ascii="Cambria Math" w:eastAsiaTheme="minorEastAsia" w:hAnsi="Cambria Math"/>
               <w:lang w:val="ru-RU"/>
             </w:rPr>
-            <m:t>,0)</m:t>
-          </m:r>
-          <m:r>
-            <w:rPr>
-              <w:rFonts w:ascii="Cambria Math" w:eastAsiaTheme="minorEastAsia" w:hAnsi="Cambria Math"/>
-              <w:lang w:val="ru-RU"/>
-            </w:rPr>
-            <m:t>=</m:t>
+            <m:t>,0)=</m:t>
           </m:r>
           <m:d>
             <m:dPr>
@@ -8825,14 +8756,7 @@
                   <w:rFonts w:ascii="Cambria Math" w:eastAsiaTheme="minorEastAsia" w:hAnsi="Cambria Math"/>
                   <w:lang w:val="ru-RU"/>
                 </w:rPr>
-                <m:t xml:space="preserve">, </m:t>
-              </m:r>
-              <m:r>
-                <w:rPr>
-                  <w:rFonts w:ascii="Cambria Math" w:eastAsiaTheme="minorEastAsia" w:hAnsi="Cambria Math"/>
-                  <w:lang w:val="ru-RU"/>
-                </w:rPr>
-                <m:t>0</m:t>
+                <m:t>, 0</m:t>
               </m:r>
             </m:e>
           </m:d>
@@ -8841,7 +8765,7 @@
     </w:p>
     <w:p>
       <w:pPr>
-        <w:pStyle w:val="ListParagraph"/>
+        <w:pStyle w:val="a4"/>
         <w:numPr>
           <w:ilvl w:val="0"/>
           <w:numId w:val="2"/>
@@ -8964,7 +8888,7 @@
     </w:p>
     <w:p>
       <w:pPr>
-        <w:pStyle w:val="ListParagraph"/>
+        <w:pStyle w:val="a4"/>
         <w:numPr>
           <w:ilvl w:val="0"/>
           <w:numId w:val="2"/>
@@ -8986,7 +8910,7 @@
     </w:p>
     <w:p>
       <w:pPr>
-        <w:pStyle w:val="Heading3"/>
+        <w:pStyle w:val="3"/>
         <w:rPr>
           <w:lang w:val="ru-RU"/>
         </w:rPr>
@@ -9102,14 +9026,7 @@
               <w:rFonts w:ascii="Cambria Math" w:eastAsiaTheme="minorEastAsia" w:hAnsi="Cambria Math"/>
               <w:lang w:val="ru-RU"/>
             </w:rPr>
-            <m:t>=</m:t>
-          </m:r>
-          <m:r>
-            <w:rPr>
-              <w:rFonts w:ascii="Cambria Math" w:eastAsiaTheme="minorEastAsia" w:hAnsi="Cambria Math"/>
-              <w:lang w:val="ru-RU"/>
-            </w:rPr>
-            <m:t>α</m:t>
+            <m:t>=α</m:t>
           </m:r>
           <m:r>
             <w:rPr>
@@ -9122,26 +9039,13 @@
               <w:rFonts w:ascii="Cambria Math" w:eastAsiaTheme="minorEastAsia" w:hAnsi="Cambria Math"/>
               <w:lang w:val="ru-RU"/>
             </w:rPr>
-            <m:t>+</m:t>
-          </m:r>
-          <m:r>
-            <w:rPr>
-              <w:rFonts w:ascii="Cambria Math" w:eastAsiaTheme="minorEastAsia" w:hAnsi="Cambria Math"/>
-              <w:lang w:val="ru-RU"/>
-            </w:rPr>
-            <m:t>β</m:t>
+            <m:t>+β</m:t>
           </m:r>
           <m:r>
             <w:rPr>
               <w:rFonts w:ascii="Cambria Math" w:eastAsiaTheme="minorEastAsia" w:hAnsi="Cambria Math"/>
             </w:rPr>
-            <m:t>y+</m:t>
-          </m:r>
-          <m:r>
-            <w:rPr>
-              <w:rFonts w:ascii="Cambria Math" w:eastAsiaTheme="minorEastAsia" w:hAnsi="Cambria Math"/>
-            </w:rPr>
-            <m:t>λ</m:t>
+            <m:t>y+λ</m:t>
           </m:r>
         </m:oMath>
       </m:oMathPara>
@@ -9158,37 +9062,7 @@
             <w:rPr>
               <w:rFonts w:ascii="Cambria Math" w:eastAsiaTheme="minorEastAsia" w:hAnsi="Cambria Math"/>
             </w:rPr>
-            <m:t>y'=</m:t>
-          </m:r>
-          <m:r>
-            <w:rPr>
-              <w:rFonts w:ascii="Cambria Math" w:eastAsiaTheme="minorEastAsia" w:hAnsi="Cambria Math"/>
-            </w:rPr>
-            <m:t>γ</m:t>
-          </m:r>
-          <m:r>
-            <w:rPr>
-              <w:rFonts w:ascii="Cambria Math" w:eastAsiaTheme="minorEastAsia" w:hAnsi="Cambria Math"/>
-            </w:rPr>
-            <m:t>x+</m:t>
-          </m:r>
-          <m:r>
-            <w:rPr>
-              <w:rFonts w:ascii="Cambria Math" w:eastAsiaTheme="minorEastAsia" w:hAnsi="Cambria Math"/>
-            </w:rPr>
-            <m:t>δ</m:t>
-          </m:r>
-          <m:r>
-            <w:rPr>
-              <w:rFonts w:ascii="Cambria Math" w:eastAsiaTheme="minorEastAsia" w:hAnsi="Cambria Math"/>
-            </w:rPr>
-            <m:t>y+</m:t>
-          </m:r>
-          <m:r>
-            <w:rPr>
-              <w:rFonts w:ascii="Cambria Math" w:eastAsiaTheme="minorEastAsia" w:hAnsi="Cambria Math"/>
-            </w:rPr>
-            <m:t>μ</m:t>
+            <m:t>y'=γx+δy+μ</m:t>
           </m:r>
         </m:oMath>
       </m:oMathPara>
@@ -10168,7 +10042,7 @@
     </w:p>
     <w:p>
       <w:pPr>
-        <w:pStyle w:val="Heading3"/>
+        <w:pStyle w:val="3"/>
         <w:rPr>
           <w:lang w:val="ru-RU"/>
         </w:rPr>
@@ -10257,7 +10131,7 @@
       <w:pPr>
         <w:rPr>
           <w:rFonts w:eastAsiaTheme="minorEastAsia"/>
-          <w:i/>
+          <w:iCs/>
           <w:lang w:val="ru-RU"/>
         </w:rPr>
       </w:pPr>
@@ -10468,6 +10342,13 @@
                     </m:ctrlPr>
                   </m:e>
                   <m:e>
+                    <m:r>
+                      <w:rPr>
+                        <w:rFonts w:ascii="Cambria Math" w:eastAsia="Cambria Math" w:hAnsi="Cambria Math" w:cs="Cambria Math"/>
+                        <w:lang w:val="ru-RU"/>
+                      </w:rPr>
+                      <m:t>-</m:t>
+                    </m:r>
                     <m:f>
                       <m:fPr>
                         <m:ctrlPr>
@@ -10484,7 +10365,7 @@
                             <w:rFonts w:ascii="Cambria Math" w:eastAsia="Cambria Math" w:hAnsi="Cambria Math" w:cs="Cambria Math"/>
                             <w:lang w:val="ru-RU"/>
                           </w:rPr>
-                          <m:t>-1</m:t>
+                          <m:t>1</m:t>
                         </m:r>
                       </m:num>
                       <m:den>
@@ -10609,15 +10490,77 @@
         </w:rPr>
         <w:t xml:space="preserve">, получим точку </w:t>
       </w:r>
-      <w:r>
-        <w:rPr>
-          <w:rFonts w:eastAsiaTheme="minorEastAsia"/>
-          <w:iCs/>
-          <w:color w:val="FF0000"/>
-          <w:lang w:val="ru-RU"/>
-        </w:rPr>
-        <w:t>ПОСЧИТАТЬ</w:t>
-      </w:r>
+      <m:oMath>
+        <m:r>
+          <w:rPr>
+            <w:rFonts w:ascii="Cambria Math" w:eastAsiaTheme="minorEastAsia" w:hAnsi="Cambria Math"/>
+            <w:lang w:val="ru-RU"/>
+          </w:rPr>
+          <m:t>(</m:t>
+        </m:r>
+        <m:r>
+          <w:rPr>
+            <w:rFonts w:ascii="Cambria Math" w:eastAsiaTheme="minorEastAsia" w:hAnsi="Cambria Math"/>
+          </w:rPr>
+          <m:t>x</m:t>
+        </m:r>
+        <m:r>
+          <w:rPr>
+            <w:rFonts w:ascii="Cambria Math" w:eastAsiaTheme="minorEastAsia" w:hAnsi="Cambria Math"/>
+            <w:lang w:val="ru-RU"/>
+          </w:rPr>
+          <m:t>,</m:t>
+        </m:r>
+        <m:r>
+          <w:rPr>
+            <w:rFonts w:ascii="Cambria Math" w:eastAsiaTheme="minorEastAsia" w:hAnsi="Cambria Math"/>
+          </w:rPr>
+          <m:t>y</m:t>
+        </m:r>
+        <m:r>
+          <w:rPr>
+            <w:rFonts w:ascii="Cambria Math" w:eastAsiaTheme="minorEastAsia" w:hAnsi="Cambria Math"/>
+            <w:lang w:val="ru-RU"/>
+          </w:rPr>
+          <m:t>,0,x+</m:t>
+        </m:r>
+        <m:f>
+          <m:fPr>
+            <m:ctrlPr>
+              <w:rPr>
+                <w:rFonts w:ascii="Cambria Math" w:eastAsiaTheme="minorEastAsia" w:hAnsi="Cambria Math"/>
+                <w:i/>
+                <w:lang w:val="ru-RU"/>
+              </w:rPr>
+            </m:ctrlPr>
+          </m:fPr>
+          <m:num>
+            <m:r>
+              <w:rPr>
+                <w:rFonts w:ascii="Cambria Math" w:eastAsiaTheme="minorEastAsia" w:hAnsi="Cambria Math"/>
+                <w:lang w:val="ru-RU"/>
+              </w:rPr>
+              <m:t>c-z</m:t>
+            </m:r>
+          </m:num>
+          <m:den>
+            <m:r>
+              <w:rPr>
+                <w:rFonts w:ascii="Cambria Math" w:eastAsiaTheme="minorEastAsia" w:hAnsi="Cambria Math"/>
+                <w:lang w:val="ru-RU"/>
+              </w:rPr>
+              <m:t>c</m:t>
+            </m:r>
+          </m:den>
+        </m:f>
+        <m:r>
+          <w:rPr>
+            <w:rFonts w:ascii="Cambria Math" w:eastAsiaTheme="minorEastAsia" w:hAnsi="Cambria Math"/>
+            <w:lang w:val="ru-RU"/>
+          </w:rPr>
+          <m:t>)</m:t>
+        </m:r>
+      </m:oMath>
       <w:r>
         <w:rPr>
           <w:rFonts w:eastAsiaTheme="minorEastAsia"/>
@@ -10749,7 +10692,7 @@
     </w:p>
     <w:p>
       <w:pPr>
-        <w:pStyle w:val="Heading2"/>
+        <w:pStyle w:val="2"/>
         <w:rPr>
           <w:lang w:val="ru-RU"/>
         </w:rPr>
@@ -10778,7 +10721,7 @@
     </w:p>
     <w:p>
       <w:pPr>
-        <w:pStyle w:val="ListParagraph"/>
+        <w:pStyle w:val="a4"/>
         <w:numPr>
           <w:ilvl w:val="0"/>
           <w:numId w:val="3"/>
@@ -10796,7 +10739,7 @@
     </w:p>
     <w:p>
       <w:pPr>
-        <w:pStyle w:val="ListParagraph"/>
+        <w:pStyle w:val="a4"/>
         <w:numPr>
           <w:ilvl w:val="0"/>
           <w:numId w:val="3"/>
@@ -10814,7 +10757,7 @@
     </w:p>
     <w:p>
       <w:pPr>
-        <w:pStyle w:val="ListParagraph"/>
+        <w:pStyle w:val="a4"/>
         <w:numPr>
           <w:ilvl w:val="0"/>
           <w:numId w:val="3"/>
@@ -10832,7 +10775,7 @@
     </w:p>
     <w:p>
       <w:pPr>
-        <w:pStyle w:val="ListParagraph"/>
+        <w:pStyle w:val="a4"/>
         <w:numPr>
           <w:ilvl w:val="0"/>
           <w:numId w:val="3"/>
@@ -10850,7 +10793,7 @@
     </w:p>
     <w:p>
       <w:pPr>
-        <w:pStyle w:val="Heading2"/>
+        <w:pStyle w:val="2"/>
         <w:rPr>
           <w:lang w:val="ru-RU"/>
         </w:rPr>
@@ -10962,7 +10905,31 @@
           <w:lang w:val="ru-RU"/>
         </w:rPr>
         <w:tab/>
-        <w:t xml:space="preserve">Э.Эйнджел – Интерактивая компьютерная графика. Вводный курс на базе </w:t>
+        <w:t>Э.</w:t>
+      </w:r>
+      <w:r>
+        <w:rPr>
+          <w:lang w:val="ru-RU"/>
+        </w:rPr>
+        <w:t xml:space="preserve"> </w:t>
+      </w:r>
+      <w:r>
+        <w:rPr>
+          <w:lang w:val="ru-RU"/>
+        </w:rPr>
+        <w:t xml:space="preserve">Эйнджел – </w:t>
+      </w:r>
+      <w:r>
+        <w:rPr>
+          <w:lang w:val="ru-RU"/>
+        </w:rPr>
+        <w:t>Интерактивная</w:t>
+      </w:r>
+      <w:r>
+        <w:rPr>
+          <w:lang w:val="ru-RU"/>
+        </w:rPr>
+        <w:t xml:space="preserve"> компьютерная графика. Вводный курс на базе </w:t>
       </w:r>
       <w:r>
         <w:t>OpenGL</w:t>
@@ -11768,15 +11735,15 @@
     <w:lsdException w:name="Unresolved Mention" w:semiHidden="1" w:unhideWhenUsed="1"/>
     <w:lsdException w:name="Smart Link" w:semiHidden="1" w:unhideWhenUsed="1"/>
   </w:latentStyles>
-  <w:style w:type="paragraph" w:default="1" w:styleId="Normal">
+  <w:style w:type="paragraph" w:default="1" w:styleId="a">
     <w:name w:val="Normal"/>
     <w:qFormat/>
   </w:style>
-  <w:style w:type="paragraph" w:styleId="Heading1">
+  <w:style w:type="paragraph" w:styleId="1">
     <w:name w:val="heading 1"/>
-    <w:basedOn w:val="Normal"/>
-    <w:next w:val="Normal"/>
-    <w:link w:val="Heading1Char"/>
+    <w:basedOn w:val="a"/>
+    <w:next w:val="a"/>
+    <w:link w:val="10"/>
     <w:uiPriority w:val="9"/>
     <w:qFormat/>
     <w:rsid w:val="008A04DE"/>
@@ -11793,11 +11760,11 @@
       <w:szCs w:val="32"/>
     </w:rPr>
   </w:style>
-  <w:style w:type="paragraph" w:styleId="Heading2">
+  <w:style w:type="paragraph" w:styleId="2">
     <w:name w:val="heading 2"/>
-    <w:basedOn w:val="Normal"/>
-    <w:next w:val="Normal"/>
-    <w:link w:val="Heading2Char"/>
+    <w:basedOn w:val="a"/>
+    <w:next w:val="a"/>
+    <w:link w:val="20"/>
     <w:uiPriority w:val="9"/>
     <w:unhideWhenUsed/>
     <w:qFormat/>
@@ -11815,11 +11782,11 @@
       <w:szCs w:val="26"/>
     </w:rPr>
   </w:style>
-  <w:style w:type="paragraph" w:styleId="Heading3">
+  <w:style w:type="paragraph" w:styleId="3">
     <w:name w:val="heading 3"/>
-    <w:basedOn w:val="Normal"/>
-    <w:next w:val="Normal"/>
-    <w:link w:val="Heading3Char"/>
+    <w:basedOn w:val="a"/>
+    <w:next w:val="a"/>
+    <w:link w:val="30"/>
     <w:uiPriority w:val="9"/>
     <w:unhideWhenUsed/>
     <w:qFormat/>
@@ -11837,13 +11804,13 @@
       <w:szCs w:val="24"/>
     </w:rPr>
   </w:style>
-  <w:style w:type="character" w:default="1" w:styleId="DefaultParagraphFont">
+  <w:style w:type="character" w:default="1" w:styleId="a0">
     <w:name w:val="Default Paragraph Font"/>
     <w:uiPriority w:val="1"/>
     <w:semiHidden/>
     <w:unhideWhenUsed/>
   </w:style>
-  <w:style w:type="table" w:default="1" w:styleId="TableNormal">
+  <w:style w:type="table" w:default="1" w:styleId="a1">
     <w:name w:val="Normal Table"/>
     <w:uiPriority w:val="99"/>
     <w:semiHidden/>
@@ -11858,16 +11825,16 @@
       </w:tblCellMar>
     </w:tblPr>
   </w:style>
-  <w:style w:type="numbering" w:default="1" w:styleId="NoList">
+  <w:style w:type="numbering" w:default="1" w:styleId="a2">
     <w:name w:val="No List"/>
     <w:uiPriority w:val="99"/>
     <w:semiHidden/>
     <w:unhideWhenUsed/>
   </w:style>
-  <w:style w:type="character" w:customStyle="1" w:styleId="Heading1Char">
-    <w:name w:val="Heading 1 Char"/>
-    <w:basedOn w:val="DefaultParagraphFont"/>
-    <w:link w:val="Heading1"/>
+  <w:style w:type="character" w:customStyle="1" w:styleId="10">
+    <w:name w:val="Заголовок 1 Знак"/>
+    <w:basedOn w:val="a0"/>
+    <w:link w:val="1"/>
     <w:uiPriority w:val="9"/>
     <w:rsid w:val="008A04DE"/>
     <w:rPr>
@@ -11877,10 +11844,10 @@
       <w:szCs w:val="32"/>
     </w:rPr>
   </w:style>
-  <w:style w:type="character" w:customStyle="1" w:styleId="Heading2Char">
-    <w:name w:val="Heading 2 Char"/>
-    <w:basedOn w:val="DefaultParagraphFont"/>
-    <w:link w:val="Heading2"/>
+  <w:style w:type="character" w:customStyle="1" w:styleId="20">
+    <w:name w:val="Заголовок 2 Знак"/>
+    <w:basedOn w:val="a0"/>
+    <w:link w:val="2"/>
     <w:uiPriority w:val="9"/>
     <w:rsid w:val="008A04DE"/>
     <w:rPr>
@@ -11890,9 +11857,9 @@
       <w:szCs w:val="26"/>
     </w:rPr>
   </w:style>
-  <w:style w:type="character" w:styleId="PlaceholderText">
+  <w:style w:type="character" w:styleId="a3">
     <w:name w:val="Placeholder Text"/>
-    <w:basedOn w:val="DefaultParagraphFont"/>
+    <w:basedOn w:val="a0"/>
     <w:uiPriority w:val="99"/>
     <w:semiHidden/>
     <w:rsid w:val="00FE6940"/>
@@ -11900,9 +11867,9 @@
       <w:color w:val="808080"/>
     </w:rPr>
   </w:style>
-  <w:style w:type="paragraph" w:styleId="ListParagraph">
+  <w:style w:type="paragraph" w:styleId="a4">
     <w:name w:val="List Paragraph"/>
-    <w:basedOn w:val="Normal"/>
+    <w:basedOn w:val="a"/>
     <w:uiPriority w:val="34"/>
     <w:qFormat/>
     <w:rsid w:val="00FE6940"/>
@@ -11911,10 +11878,10 @@
       <w:contextualSpacing/>
     </w:pPr>
   </w:style>
-  <w:style w:type="paragraph" w:styleId="Caption">
+  <w:style w:type="paragraph" w:styleId="a5">
     <w:name w:val="caption"/>
-    <w:basedOn w:val="Normal"/>
-    <w:next w:val="Normal"/>
+    <w:basedOn w:val="a"/>
+    <w:next w:val="a"/>
     <w:uiPriority w:val="35"/>
     <w:unhideWhenUsed/>
     <w:qFormat/>
@@ -11930,10 +11897,10 @@
       <w:szCs w:val="18"/>
     </w:rPr>
   </w:style>
-  <w:style w:type="character" w:customStyle="1" w:styleId="Heading3Char">
-    <w:name w:val="Heading 3 Char"/>
-    <w:basedOn w:val="DefaultParagraphFont"/>
-    <w:link w:val="Heading3"/>
+  <w:style w:type="character" w:customStyle="1" w:styleId="30">
+    <w:name w:val="Заголовок 3 Знак"/>
+    <w:basedOn w:val="a0"/>
+    <w:link w:val="3"/>
     <w:uiPriority w:val="9"/>
     <w:rsid w:val="00F059F3"/>
     <w:rPr>
@@ -11943,10 +11910,10 @@
       <w:szCs w:val="24"/>
     </w:rPr>
   </w:style>
-  <w:style w:type="paragraph" w:styleId="TOCHeading">
+  <w:style w:type="paragraph" w:styleId="a6">
     <w:name w:val="TOC Heading"/>
-    <w:basedOn w:val="Heading1"/>
-    <w:next w:val="Normal"/>
+    <w:basedOn w:val="1"/>
+    <w:next w:val="a"/>
     <w:uiPriority w:val="39"/>
     <w:unhideWhenUsed/>
     <w:qFormat/>
@@ -11955,10 +11922,10 @@
       <w:outlineLvl w:val="9"/>
     </w:pPr>
   </w:style>
-  <w:style w:type="paragraph" w:styleId="TOC1">
+  <w:style w:type="paragraph" w:styleId="11">
     <w:name w:val="toc 1"/>
-    <w:basedOn w:val="Normal"/>
-    <w:next w:val="Normal"/>
+    <w:basedOn w:val="a"/>
+    <w:next w:val="a"/>
     <w:autoRedefine/>
     <w:uiPriority w:val="39"/>
     <w:unhideWhenUsed/>
@@ -11967,10 +11934,10 @@
       <w:spacing w:after="100"/>
     </w:pPr>
   </w:style>
-  <w:style w:type="paragraph" w:styleId="TOC2">
+  <w:style w:type="paragraph" w:styleId="21">
     <w:name w:val="toc 2"/>
-    <w:basedOn w:val="Normal"/>
-    <w:next w:val="Normal"/>
+    <w:basedOn w:val="a"/>
+    <w:next w:val="a"/>
     <w:autoRedefine/>
     <w:uiPriority w:val="39"/>
     <w:unhideWhenUsed/>
@@ -11980,10 +11947,10 @@
       <w:ind w:left="220"/>
     </w:pPr>
   </w:style>
-  <w:style w:type="paragraph" w:styleId="TOC3">
+  <w:style w:type="paragraph" w:styleId="31">
     <w:name w:val="toc 3"/>
-    <w:basedOn w:val="Normal"/>
-    <w:next w:val="Normal"/>
+    <w:basedOn w:val="a"/>
+    <w:next w:val="a"/>
     <w:autoRedefine/>
     <w:uiPriority w:val="39"/>
     <w:unhideWhenUsed/>
@@ -11993,9 +11960,9 @@
       <w:ind w:left="440"/>
     </w:pPr>
   </w:style>
-  <w:style w:type="character" w:styleId="Hyperlink">
+  <w:style w:type="character" w:styleId="a7">
     <w:name w:val="Hyperlink"/>
-    <w:basedOn w:val="DefaultParagraphFont"/>
+    <w:basedOn w:val="a0"/>
     <w:uiPriority w:val="99"/>
     <w:unhideWhenUsed/>
     <w:rsid w:val="00CB5A8D"/>

</xml_diff>